<commit_message>
Revise pandas summary as student handout
</commit_message>
<xml_diff>
--- a/CMP262_Week05_Pandas_Class_Summary.docx
+++ b/CMP262_Week05_Pandas_Class_Summary.docx
@@ -8,7 +8,7 @@
         <w:jc w:val="center"/>
       </w:pPr>
       <w:r>
-        <w:t>CMP 262 - Introduction to pandas</w:t>
+        <w:t>CMP 262 Introduction to pandas</w:t>
       </w:r>
     </w:p>
     <w:p>
@@ -20,18 +20,12 @@
           <w:b/>
           <w:sz w:val="28"/>
         </w:rPr>
-        <w:t>Class Summary and Teaching Examples</w:t>
+        <w:t>Week 5 Student Review Handout</w:t>
       </w:r>
     </w:p>
     <w:p>
-      <w:pPr>
-        <w:jc w:val="center"/>
-      </w:pPr>
       <w:r>
-        <w:rPr>
-          <w:i/>
-        </w:rPr>
-        <w:t>Week 5 | Exploratory Data Analysis with DataFrames</w:t>
+        <w:t>This handout reviews the pandas concepts you need for Week 5 Lab 1. Use it to understand the commands, predict their results, and check your thinking. The examples use a small book dataset so they demonstrate the concepts without completing the campus workshop assignment for you.</w:t>
       </w:r>
     </w:p>
     <w:p>
@@ -39,7 +33,7 @@
         <w:pStyle w:val="Heading1"/>
       </w:pPr>
       <w:r>
-        <w:t>Learning Goals</w:t>
+        <w:t>What You Should Be Able to Do</w:t>
       </w:r>
     </w:p>
     <w:p>
@@ -47,7 +41,7 @@
         <w:pStyle w:val="ListBullet"/>
       </w:pPr>
       <w:r>
-        <w:t>Explain why pandas is useful for exploratory data analysis.</w:t>
+        <w:t>Explain the difference between a pandas Series and DataFrame.</w:t>
       </w:r>
     </w:p>
     <w:p>
@@ -55,7 +49,7 @@
         <w:pStyle w:val="ListBullet"/>
       </w:pPr>
       <w:r>
-        <w:t>Distinguish a Series from a DataFrame.</w:t>
+        <w:t>Load an Excel file and inspect its structure.</w:t>
       </w:r>
     </w:p>
     <w:p>
@@ -63,7 +57,7 @@
         <w:pStyle w:val="ListBullet"/>
       </w:pPr>
       <w:r>
-        <w:t>Load and inspect an Excel dataset.</w:t>
+        <w:t>Calculate numerical statistics and count categories.</w:t>
       </w:r>
     </w:p>
     <w:p>
@@ -79,7 +73,7 @@
         <w:pStyle w:val="ListBullet"/>
       </w:pPr>
       <w:r>
-        <w:t>Calculate statistics, add a calculated column, sort, and filter data.</w:t>
+        <w:t>Create a calculated column, sort data, and filter rows.</w:t>
       </w:r>
     </w:p>
     <w:p>
@@ -87,17 +81,12 @@
         <w:pStyle w:val="Heading1"/>
       </w:pPr>
       <w:r>
-        <w:t>1. What Is Exploratory Data Analysis?</w:t>
+        <w:t>1 Exploratory Data Analysis</w:t>
       </w:r>
     </w:p>
     <w:p>
       <w:r>
-        <w:t>Exploratory Data Analysis (EDA) is the process of examining a dataset before making conclusions. We look at its structure, typical values, unusual values, missing data, and patterns. A useful class question is: “What should we learn about a dataset before trying to explain it?”</w:t>
-      </w:r>
-    </w:p>
-    <w:p>
-      <w:r>
-        <w:t>Teaching example: Before analyzing workshop attendance, first ask how many records exist, what each column means, which columns are numeric, and whether any values are missing.</w:t>
+        <w:t>Exploratory Data Analysis, or EDA, means examining a dataset before drawing conclusions. You first learn what the rows and columns represent, identify the data types, look for missing values, and summarize the data. This helps you decide what questions the data can answer.</w:t>
       </w:r>
     </w:p>
     <w:p>
@@ -105,27 +94,44 @@
         <w:pStyle w:val="Heading1"/>
       </w:pPr>
       <w:r>
-        <w:t>2. Series and DataFrames</w:t>
+        <w:t>2 Series and DataFrames</w:t>
       </w:r>
     </w:p>
     <w:tbl>
       <w:tblPr>
-        <w:tblStyle w:val="LightShading-Accent1"/>
         <w:tblW w:type="auto" w:w="0"/>
+        <w:tblLayout w:type="fixed"/>
         <w:tblLook w:firstColumn="1" w:firstRow="1" w:lastColumn="0" w:lastRow="0" w:noHBand="0" w:noVBand="1" w:val="04A0"/>
       </w:tblPr>
       <w:tblGrid>
-        <w:gridCol w:w="3360"/>
-        <w:gridCol w:w="3360"/>
-        <w:gridCol w:w="3360"/>
+        <w:gridCol w:w="1728"/>
+        <w:gridCol w:w="4824"/>
+        <w:gridCol w:w="3528"/>
       </w:tblGrid>
       <w:tr>
+        <w:trPr>
+          <w:cantSplit/>
+          <w:tblHeader/>
+        </w:trPr>
         <w:tc>
           <w:tcPr>
             <w:tcW w:type="dxa" w:w="3360"/>
+            <w:vAlign w:val="center"/>
+            <w:tcMar>
+              <w:top w:w="90" w:type="dxa"/>
+              <w:left w:w="90" w:type="dxa"/>
+              <w:bottom w:w="90" w:type="dxa"/>
+              <w:right w:w="90" w:type="dxa"/>
+            </w:tcMar>
+            <w:shd w:fill="1F4E78"/>
           </w:tcPr>
           <w:p>
+            <w:r/>
             <w:r>
+              <w:rPr>
+                <w:b/>
+                <w:color w:val="FFFFFF"/>
+              </w:rPr>
               <w:t>Object</w:t>
             </w:r>
           </w:p>
@@ -133,9 +139,22 @@
         <w:tc>
           <w:tcPr>
             <w:tcW w:type="dxa" w:w="3360"/>
+            <w:vAlign w:val="center"/>
+            <w:tcMar>
+              <w:top w:w="90" w:type="dxa"/>
+              <w:left w:w="90" w:type="dxa"/>
+              <w:bottom w:w="90" w:type="dxa"/>
+              <w:right w:w="90" w:type="dxa"/>
+            </w:tcMar>
+            <w:shd w:fill="1F4E78"/>
           </w:tcPr>
           <w:p>
+            <w:r/>
             <w:r>
+              <w:rPr>
+                <w:b/>
+                <w:color w:val="FFFFFF"/>
+              </w:rPr>
               <w:t>Meaning</w:t>
             </w:r>
           </w:p>
@@ -143,74 +162,1366 @@
         <w:tc>
           <w:tcPr>
             <w:tcW w:type="dxa" w:w="3360"/>
+            <w:vAlign w:val="center"/>
+            <w:tcMar>
+              <w:top w:w="90" w:type="dxa"/>
+              <w:left w:w="90" w:type="dxa"/>
+              <w:bottom w:w="90" w:type="dxa"/>
+              <w:right w:w="90" w:type="dxa"/>
+            </w:tcMar>
+            <w:shd w:fill="1F4E78"/>
           </w:tcPr>
           <w:p>
+            <w:r/>
             <w:r>
+              <w:rPr>
+                <w:b/>
+                <w:color w:val="FFFFFF"/>
+              </w:rPr>
               <w:t>Example</w:t>
             </w:r>
           </w:p>
         </w:tc>
       </w:tr>
       <w:tr>
+        <w:trPr>
+          <w:cantSplit/>
+        </w:trPr>
         <w:tc>
           <w:tcPr>
-            <w:tcW w:type="dxa" w:w="3360"/>
+            <w:tcW w:type="dxa" w:w="1728"/>
+            <w:vAlign w:val="center"/>
+            <w:tcMar>
+              <w:top w:w="90" w:type="dxa"/>
+              <w:left w:w="90" w:type="dxa"/>
+              <w:bottom w:w="90" w:type="dxa"/>
+              <w:right w:w="90" w:type="dxa"/>
+            </w:tcMar>
+            <w:shd w:fill="EAF2F8"/>
           </w:tcPr>
           <w:p>
+            <w:r/>
             <w:r>
+              <w:rPr>
+                <w:b w:val="0"/>
+              </w:rPr>
               <w:t>Series</w:t>
             </w:r>
           </w:p>
         </w:tc>
         <w:tc>
           <w:tcPr>
-            <w:tcW w:type="dxa" w:w="3360"/>
+            <w:tcW w:type="dxa" w:w="4824"/>
+            <w:vAlign w:val="center"/>
+            <w:tcMar>
+              <w:top w:w="90" w:type="dxa"/>
+              <w:left w:w="90" w:type="dxa"/>
+              <w:bottom w:w="90" w:type="dxa"/>
+              <w:right w:w="90" w:type="dxa"/>
+            </w:tcMar>
+            <w:shd w:fill="EAF2F8"/>
           </w:tcPr>
           <w:p>
+            <w:r/>
             <w:r>
-              <w:t>One-dimensional labeled data; usually one column</w:t>
+              <w:rPr>
+                <w:b w:val="0"/>
+              </w:rPr>
+              <w:t>One dimensional labeled data, usually one column</w:t>
+            </w:r>
+          </w:p>
+        </w:tc>
+        <w:tc>
+          <w:tcPr>
+            <w:tcW w:type="dxa" w:w="3528"/>
+            <w:vAlign w:val="center"/>
+            <w:tcMar>
+              <w:top w:w="90" w:type="dxa"/>
+              <w:left w:w="90" w:type="dxa"/>
+              <w:bottom w:w="90" w:type="dxa"/>
+              <w:right w:w="90" w:type="dxa"/>
+            </w:tcMar>
+            <w:shd w:fill="EAF2F8"/>
+          </w:tcPr>
+          <w:p>
+            <w:r/>
+            <w:r>
+              <w:rPr>
+                <w:b w:val="0"/>
+              </w:rPr>
+              <w:t>books["Title"]</w:t>
+            </w:r>
+          </w:p>
+        </w:tc>
+      </w:tr>
+      <w:tr>
+        <w:trPr>
+          <w:cantSplit/>
+        </w:trPr>
+        <w:tc>
+          <w:tcPr>
+            <w:tcW w:type="dxa" w:w="1728"/>
+            <w:vAlign w:val="center"/>
+            <w:tcMar>
+              <w:top w:w="90" w:type="dxa"/>
+              <w:left w:w="90" w:type="dxa"/>
+              <w:bottom w:w="90" w:type="dxa"/>
+              <w:right w:w="90" w:type="dxa"/>
+            </w:tcMar>
+            <w:shd w:fill="FFFFFF"/>
+          </w:tcPr>
+          <w:p>
+            <w:r/>
+            <w:r>
+              <w:rPr>
+                <w:b w:val="0"/>
+              </w:rPr>
+              <w:t>DataFrame</w:t>
+            </w:r>
+          </w:p>
+        </w:tc>
+        <w:tc>
+          <w:tcPr>
+            <w:tcW w:type="dxa" w:w="4824"/>
+            <w:vAlign w:val="center"/>
+            <w:tcMar>
+              <w:top w:w="90" w:type="dxa"/>
+              <w:left w:w="90" w:type="dxa"/>
+              <w:bottom w:w="90" w:type="dxa"/>
+              <w:right w:w="90" w:type="dxa"/>
+            </w:tcMar>
+            <w:shd w:fill="FFFFFF"/>
+          </w:tcPr>
+          <w:p>
+            <w:r/>
+            <w:r>
+              <w:rPr>
+                <w:b w:val="0"/>
+              </w:rPr>
+              <w:t>A two dimensional table with rows and columns</w:t>
+            </w:r>
+          </w:p>
+        </w:tc>
+        <w:tc>
+          <w:tcPr>
+            <w:tcW w:type="dxa" w:w="3528"/>
+            <w:vAlign w:val="center"/>
+            <w:tcMar>
+              <w:top w:w="90" w:type="dxa"/>
+              <w:left w:w="90" w:type="dxa"/>
+              <w:bottom w:w="90" w:type="dxa"/>
+              <w:right w:w="90" w:type="dxa"/>
+            </w:tcMar>
+            <w:shd w:fill="FFFFFF"/>
+          </w:tcPr>
+          <w:p>
+            <w:r/>
+            <w:r>
+              <w:rPr>
+                <w:b w:val="0"/>
+              </w:rPr>
+              <w:t>books[["Title", "Genre"]]</w:t>
+            </w:r>
+          </w:p>
+        </w:tc>
+      </w:tr>
+    </w:tbl>
+    <w:p>
+      <w:r>
+        <w:t>Notice the brackets: selecting one column uses one pair of brackets. Selecting several columns requires a list of column names inside the outer brackets.</w:t>
+      </w:r>
+    </w:p>
+    <w:p>
+      <w:pPr>
+        <w:pStyle w:val="Heading1"/>
+      </w:pPr>
+      <w:r>
+        <w:t>3 Load and Preview Data</w:t>
+      </w:r>
+    </w:p>
+    <w:p>
+      <w:r>
+        <w:t>A common pandas alias is pd. The read_excel() function loads an Excel worksheet into a DataFrame.</w:t>
+      </w:r>
+    </w:p>
+    <w:p>
+      <w:pPr>
+        <w:spacing w:after="80"/>
+        <w:ind w:left="360"/>
+      </w:pPr>
+      <w:r>
+        <w:rPr>
+          <w:rFonts w:ascii="Consolas" w:hAnsi="Consolas"/>
+          <w:sz w:val="19"/>
+        </w:rPr>
+        <w:t>import pandas as pd</w:t>
+      </w:r>
+    </w:p>
+    <w:p>
+      <w:pPr>
+        <w:spacing w:after="80"/>
+        <w:ind w:left="360"/>
+      </w:pPr>
+      <w:r>
+        <w:rPr>
+          <w:rFonts w:ascii="Consolas" w:hAnsi="Consolas"/>
+          <w:sz w:val="19"/>
+        </w:rPr>
+        <w:t>books = pd.read_excel("BookData.xlsx")</w:t>
+      </w:r>
+    </w:p>
+    <w:p>
+      <w:pPr>
+        <w:spacing w:after="80"/>
+        <w:ind w:left="360"/>
+      </w:pPr>
+      <w:r>
+        <w:rPr>
+          <w:rFonts w:ascii="Consolas" w:hAnsi="Consolas"/>
+          <w:sz w:val="19"/>
+        </w:rPr>
+        <w:t>books.head()          # first five rows</w:t>
+      </w:r>
+    </w:p>
+    <w:p>
+      <w:pPr>
+        <w:spacing w:after="80"/>
+        <w:ind w:left="360"/>
+      </w:pPr>
+      <w:r>
+        <w:rPr>
+          <w:rFonts w:ascii="Consolas" w:hAnsi="Consolas"/>
+          <w:sz w:val="19"/>
+        </w:rPr>
+        <w:t>books.tail(3)         # last three rows</w:t>
+      </w:r>
+    </w:p>
+    <w:p>
+      <w:pPr>
+        <w:spacing w:after="80"/>
+        <w:ind w:left="360"/>
+      </w:pPr>
+      <w:r>
+        <w:rPr>
+          <w:rFonts w:ascii="Consolas" w:hAnsi="Consolas"/>
+          <w:sz w:val="19"/>
+        </w:rPr>
+        <w:t>books.shape           # number of rows and columns</w:t>
+      </w:r>
+    </w:p>
+    <w:p>
+      <w:pPr>
+        <w:spacing w:after="80"/>
+        <w:ind w:left="360"/>
+      </w:pPr>
+      <w:r>
+        <w:rPr>
+          <w:rFonts w:ascii="Consolas" w:hAnsi="Consolas"/>
+          <w:sz w:val="19"/>
+        </w:rPr>
+        <w:t>books.sample(4, random_state=3)</w:t>
+      </w:r>
+    </w:p>
+    <w:p>
+      <w:r>
+        <w:t>Remember: shape is an attribute, so it does not use parentheses. head(), tail(), and sample() are methods, so they do use parentheses.</w:t>
+      </w:r>
+    </w:p>
+    <w:p>
+      <w:pPr>
+        <w:pStyle w:val="Heading1"/>
+      </w:pPr>
+      <w:r>
+        <w:t>4 Understand the Columns</w:t>
+      </w:r>
+    </w:p>
+    <w:p>
+      <w:pPr>
+        <w:spacing w:after="80"/>
+        <w:ind w:left="360"/>
+      </w:pPr>
+      <w:r>
+        <w:rPr>
+          <w:rFonts w:ascii="Consolas" w:hAnsi="Consolas"/>
+          <w:sz w:val="19"/>
+        </w:rPr>
+        <w:t>books.columns</w:t>
+      </w:r>
+    </w:p>
+    <w:p>
+      <w:pPr>
+        <w:spacing w:after="80"/>
+        <w:ind w:left="360"/>
+      </w:pPr>
+      <w:r>
+        <w:rPr>
+          <w:rFonts w:ascii="Consolas" w:hAnsi="Consolas"/>
+          <w:sz w:val="19"/>
+        </w:rPr>
+        <w:t>books.dtypes</w:t>
+      </w:r>
+    </w:p>
+    <w:p>
+      <w:pPr>
+        <w:spacing w:after="80"/>
+        <w:ind w:left="360"/>
+      </w:pPr>
+      <w:r>
+        <w:rPr>
+          <w:rFonts w:ascii="Consolas" w:hAnsi="Consolas"/>
+          <w:sz w:val="19"/>
+        </w:rPr>
+        <w:t>books.info()</w:t>
+      </w:r>
+    </w:p>
+    <w:p>
+      <w:r>
+        <w:t>columns lists the column labels. dtypes shows the type stored in each column. info() provides the column names, data types, and non-null counts. A lower non-null count means that column contains missing values.</w:t>
+      </w:r>
+    </w:p>
+    <w:p>
+      <w:pPr>
+        <w:pStyle w:val="Heading1"/>
+      </w:pPr>
+      <w:r>
+        <w:t>5 Summarize Data</w:t>
+      </w:r>
+    </w:p>
+    <w:p>
+      <w:r>
+        <w:t>Use numerical methods to answer questions about number columns:</w:t>
+      </w:r>
+    </w:p>
+    <w:p>
+      <w:pPr>
+        <w:spacing w:after="80"/>
+        <w:ind w:left="360"/>
+      </w:pPr>
+      <w:r>
+        <w:rPr>
+          <w:rFonts w:ascii="Consolas" w:hAnsi="Consolas"/>
+          <w:sz w:val="19"/>
+        </w:rPr>
+        <w:t>books["Pages"].mean()</w:t>
+      </w:r>
+    </w:p>
+    <w:p>
+      <w:pPr>
+        <w:spacing w:after="80"/>
+        <w:ind w:left="360"/>
+      </w:pPr>
+      <w:r>
+        <w:rPr>
+          <w:rFonts w:ascii="Consolas" w:hAnsi="Consolas"/>
+          <w:sz w:val="19"/>
+        </w:rPr>
+        <w:t>books["Pages"].median()</w:t>
+      </w:r>
+    </w:p>
+    <w:p>
+      <w:pPr>
+        <w:spacing w:after="80"/>
+        <w:ind w:left="360"/>
+      </w:pPr>
+      <w:r>
+        <w:rPr>
+          <w:rFonts w:ascii="Consolas" w:hAnsi="Consolas"/>
+          <w:sz w:val="19"/>
+        </w:rPr>
+        <w:t>books["Pages"].min()</w:t>
+      </w:r>
+    </w:p>
+    <w:p>
+      <w:pPr>
+        <w:spacing w:after="80"/>
+        <w:ind w:left="360"/>
+      </w:pPr>
+      <w:r>
+        <w:rPr>
+          <w:rFonts w:ascii="Consolas" w:hAnsi="Consolas"/>
+          <w:sz w:val="19"/>
+        </w:rPr>
+        <w:t>books["Pages"].max()</w:t>
+      </w:r>
+    </w:p>
+    <w:p>
+      <w:pPr>
+        <w:spacing w:after="80"/>
+        <w:ind w:left="360"/>
+      </w:pPr>
+      <w:r>
+        <w:rPr>
+          <w:rFonts w:ascii="Consolas" w:hAnsi="Consolas"/>
+          <w:sz w:val="19"/>
+        </w:rPr>
+        <w:t>books.describe()</w:t>
+      </w:r>
+    </w:p>
+    <w:p>
+      <w:r>
+        <w:t>For categorical data, use unique() to see the available categories and value_counts() to count them:</w:t>
+      </w:r>
+    </w:p>
+    <w:p>
+      <w:pPr>
+        <w:spacing w:after="80"/>
+        <w:ind w:left="360"/>
+      </w:pPr>
+      <w:r>
+        <w:rPr>
+          <w:rFonts w:ascii="Consolas" w:hAnsi="Consolas"/>
+          <w:sz w:val="19"/>
+        </w:rPr>
+        <w:t>books["Genre"].unique()</w:t>
+      </w:r>
+    </w:p>
+    <w:p>
+      <w:pPr>
+        <w:spacing w:after="80"/>
+        <w:ind w:left="360"/>
+      </w:pPr>
+      <w:r>
+        <w:rPr>
+          <w:rFonts w:ascii="Consolas" w:hAnsi="Consolas"/>
+          <w:sz w:val="19"/>
+        </w:rPr>
+        <w:t>books["Genre"].value_counts()</w:t>
+      </w:r>
+    </w:p>
+    <w:p>
+      <w:pPr>
+        <w:pStyle w:val="Heading1"/>
+      </w:pPr>
+      <w:r>
+        <w:t>6 Select Rows and Columns</w:t>
+      </w:r>
+    </w:p>
+    <w:tbl>
+      <w:tblPr>
+        <w:tblW w:type="auto" w:w="0"/>
+        <w:tblLayout w:type="fixed"/>
+        <w:tblLook w:firstColumn="1" w:firstRow="1" w:lastColumn="0" w:lastRow="0" w:noHBand="0" w:noVBand="1" w:val="04A0"/>
+      </w:tblPr>
+      <w:tblGrid>
+        <w:gridCol w:w="1728"/>
+        <w:gridCol w:w="4824"/>
+        <w:gridCol w:w="3528"/>
+      </w:tblGrid>
+      <w:tr>
+        <w:trPr>
+          <w:cantSplit/>
+          <w:tblHeader/>
+        </w:trPr>
+        <w:tc>
+          <w:tcPr>
+            <w:tcW w:type="dxa" w:w="3360"/>
+            <w:vAlign w:val="center"/>
+            <w:tcMar>
+              <w:top w:w="90" w:type="dxa"/>
+              <w:left w:w="90" w:type="dxa"/>
+              <w:bottom w:w="90" w:type="dxa"/>
+              <w:right w:w="90" w:type="dxa"/>
+            </w:tcMar>
+            <w:shd w:fill="1F4E78"/>
+          </w:tcPr>
+          <w:p>
+            <w:r/>
+            <w:r>
+              <w:rPr>
+                <w:b/>
+                <w:color w:val="FFFFFF"/>
+              </w:rPr>
+              <w:t>Goal</w:t>
             </w:r>
           </w:p>
         </w:tc>
         <w:tc>
           <w:tcPr>
             <w:tcW w:type="dxa" w:w="3360"/>
+            <w:vAlign w:val="center"/>
+            <w:tcMar>
+              <w:top w:w="90" w:type="dxa"/>
+              <w:left w:w="90" w:type="dxa"/>
+              <w:bottom w:w="90" w:type="dxa"/>
+              <w:right w:w="90" w:type="dxa"/>
+            </w:tcMar>
+            <w:shd w:fill="1F4E78"/>
           </w:tcPr>
           <w:p>
+            <w:r/>
             <w:r>
-              <w:t>workshops["Workshop"]</w:t>
-            </w:r>
-          </w:p>
-        </w:tc>
-      </w:tr>
-      <w:tr>
-        <w:tc>
-          <w:tcPr>
-            <w:tcW w:type="dxa" w:w="3360"/>
-          </w:tcPr>
-          <w:p>
-            <w:r>
-              <w:t>DataFrame</w:t>
+              <w:rPr>
+                <w:b/>
+                <w:color w:val="FFFFFF"/>
+              </w:rPr>
+              <w:t>Example</w:t>
             </w:r>
           </w:p>
         </w:tc>
         <w:tc>
           <w:tcPr>
             <w:tcW w:type="dxa" w:w="3360"/>
+            <w:vAlign w:val="center"/>
+            <w:tcMar>
+              <w:top w:w="90" w:type="dxa"/>
+              <w:left w:w="90" w:type="dxa"/>
+              <w:bottom w:w="90" w:type="dxa"/>
+              <w:right w:w="90" w:type="dxa"/>
+            </w:tcMar>
+            <w:shd w:fill="1F4E78"/>
           </w:tcPr>
           <w:p>
+            <w:r/>
             <w:r>
-              <w:t>Two-dimensional table with rows and columns</w:t>
+              <w:rPr>
+                <w:b/>
+                <w:color w:val="FFFFFF"/>
+              </w:rPr>
+              <w:t>What It Returns</w:t>
+            </w:r>
+          </w:p>
+        </w:tc>
+      </w:tr>
+      <w:tr>
+        <w:trPr>
+          <w:cantSplit/>
+        </w:trPr>
+        <w:tc>
+          <w:tcPr>
+            <w:tcW w:type="dxa" w:w="1728"/>
+            <w:vAlign w:val="center"/>
+            <w:tcMar>
+              <w:top w:w="90" w:type="dxa"/>
+              <w:left w:w="90" w:type="dxa"/>
+              <w:bottom w:w="90" w:type="dxa"/>
+              <w:right w:w="90" w:type="dxa"/>
+            </w:tcMar>
+            <w:shd w:fill="EAF2F8"/>
+          </w:tcPr>
+          <w:p>
+            <w:r/>
+            <w:r>
+              <w:rPr>
+                <w:b w:val="0"/>
+              </w:rPr>
+              <w:t>One column</w:t>
             </w:r>
           </w:p>
         </w:tc>
         <w:tc>
           <w:tcPr>
-            <w:tcW w:type="dxa" w:w="3360"/>
+            <w:tcW w:type="dxa" w:w="4824"/>
+            <w:vAlign w:val="center"/>
+            <w:tcMar>
+              <w:top w:w="90" w:type="dxa"/>
+              <w:left w:w="90" w:type="dxa"/>
+              <w:bottom w:w="90" w:type="dxa"/>
+              <w:right w:w="90" w:type="dxa"/>
+            </w:tcMar>
+            <w:shd w:fill="EAF2F8"/>
           </w:tcPr>
           <w:p>
+            <w:r/>
             <w:r>
-              <w:t>workshops[["Workshop", "Category"]]</w:t>
+              <w:rPr>
+                <w:b w:val="0"/>
+              </w:rPr>
+              <w:t>books["Title"]</w:t>
+            </w:r>
+          </w:p>
+        </w:tc>
+        <w:tc>
+          <w:tcPr>
+            <w:tcW w:type="dxa" w:w="3528"/>
+            <w:vAlign w:val="center"/>
+            <w:tcMar>
+              <w:top w:w="90" w:type="dxa"/>
+              <w:left w:w="90" w:type="dxa"/>
+              <w:bottom w:w="90" w:type="dxa"/>
+              <w:right w:w="90" w:type="dxa"/>
+            </w:tcMar>
+            <w:shd w:fill="EAF2F8"/>
+          </w:tcPr>
+          <w:p>
+            <w:r/>
+            <w:r>
+              <w:rPr>
+                <w:b w:val="0"/>
+              </w:rPr>
+              <w:t>A Series</w:t>
+            </w:r>
+          </w:p>
+        </w:tc>
+      </w:tr>
+      <w:tr>
+        <w:trPr>
+          <w:cantSplit/>
+        </w:trPr>
+        <w:tc>
+          <w:tcPr>
+            <w:tcW w:type="dxa" w:w="1728"/>
+            <w:vAlign w:val="center"/>
+            <w:tcMar>
+              <w:top w:w="90" w:type="dxa"/>
+              <w:left w:w="90" w:type="dxa"/>
+              <w:bottom w:w="90" w:type="dxa"/>
+              <w:right w:w="90" w:type="dxa"/>
+            </w:tcMar>
+            <w:shd w:fill="FFFFFF"/>
+          </w:tcPr>
+          <w:p>
+            <w:r/>
+            <w:r>
+              <w:rPr>
+                <w:b w:val="0"/>
+              </w:rPr>
+              <w:t>Several columns</w:t>
+            </w:r>
+          </w:p>
+        </w:tc>
+        <w:tc>
+          <w:tcPr>
+            <w:tcW w:type="dxa" w:w="4824"/>
+            <w:vAlign w:val="center"/>
+            <w:tcMar>
+              <w:top w:w="90" w:type="dxa"/>
+              <w:left w:w="90" w:type="dxa"/>
+              <w:bottom w:w="90" w:type="dxa"/>
+              <w:right w:w="90" w:type="dxa"/>
+            </w:tcMar>
+            <w:shd w:fill="FFFFFF"/>
+          </w:tcPr>
+          <w:p>
+            <w:r/>
+            <w:r>
+              <w:rPr>
+                <w:b w:val="0"/>
+              </w:rPr>
+              <w:t>books[["Title", "Genre"]]</w:t>
+            </w:r>
+          </w:p>
+        </w:tc>
+        <w:tc>
+          <w:tcPr>
+            <w:tcW w:type="dxa" w:w="3528"/>
+            <w:vAlign w:val="center"/>
+            <w:tcMar>
+              <w:top w:w="90" w:type="dxa"/>
+              <w:left w:w="90" w:type="dxa"/>
+              <w:bottom w:w="90" w:type="dxa"/>
+              <w:right w:w="90" w:type="dxa"/>
+            </w:tcMar>
+            <w:shd w:fill="FFFFFF"/>
+          </w:tcPr>
+          <w:p>
+            <w:r/>
+            <w:r>
+              <w:rPr>
+                <w:b w:val="0"/>
+              </w:rPr>
+              <w:t>A DataFrame</w:t>
+            </w:r>
+          </w:p>
+        </w:tc>
+      </w:tr>
+      <w:tr>
+        <w:trPr>
+          <w:cantSplit/>
+        </w:trPr>
+        <w:tc>
+          <w:tcPr>
+            <w:tcW w:type="dxa" w:w="1728"/>
+            <w:vAlign w:val="center"/>
+            <w:tcMar>
+              <w:top w:w="90" w:type="dxa"/>
+              <w:left w:w="90" w:type="dxa"/>
+              <w:bottom w:w="90" w:type="dxa"/>
+              <w:right w:w="90" w:type="dxa"/>
+            </w:tcMar>
+            <w:shd w:fill="EAF2F8"/>
+          </w:tcPr>
+          <w:p>
+            <w:r/>
+            <w:r>
+              <w:rPr>
+                <w:b w:val="0"/>
+              </w:rPr>
+              <w:t>Labels with loc</w:t>
+            </w:r>
+          </w:p>
+        </w:tc>
+        <w:tc>
+          <w:tcPr>
+            <w:tcW w:type="dxa" w:w="4824"/>
+            <w:vAlign w:val="center"/>
+            <w:tcMar>
+              <w:top w:w="90" w:type="dxa"/>
+              <w:left w:w="90" w:type="dxa"/>
+              <w:bottom w:w="90" w:type="dxa"/>
+              <w:right w:w="90" w:type="dxa"/>
+            </w:tcMar>
+            <w:shd w:fill="EAF2F8"/>
+          </w:tcPr>
+          <w:p>
+            <w:r/>
+            <w:r>
+              <w:rPr>
+                <w:b w:val="0"/>
+              </w:rPr>
+              <w:t>books.loc[1:3, "Title":"Pages"]</w:t>
+            </w:r>
+          </w:p>
+        </w:tc>
+        <w:tc>
+          <w:tcPr>
+            <w:tcW w:type="dxa" w:w="3528"/>
+            <w:vAlign w:val="center"/>
+            <w:tcMar>
+              <w:top w:w="90" w:type="dxa"/>
+              <w:left w:w="90" w:type="dxa"/>
+              <w:bottom w:w="90" w:type="dxa"/>
+              <w:right w:w="90" w:type="dxa"/>
+            </w:tcMar>
+            <w:shd w:fill="EAF2F8"/>
+          </w:tcPr>
+          <w:p>
+            <w:r/>
+            <w:r>
+              <w:rPr>
+                <w:b w:val="0"/>
+              </w:rPr>
+              <w:t>Ending labels included</w:t>
+            </w:r>
+          </w:p>
+        </w:tc>
+      </w:tr>
+      <w:tr>
+        <w:trPr>
+          <w:cantSplit/>
+        </w:trPr>
+        <w:tc>
+          <w:tcPr>
+            <w:tcW w:type="dxa" w:w="1728"/>
+            <w:vAlign w:val="center"/>
+            <w:tcMar>
+              <w:top w:w="90" w:type="dxa"/>
+              <w:left w:w="90" w:type="dxa"/>
+              <w:bottom w:w="90" w:type="dxa"/>
+              <w:right w:w="90" w:type="dxa"/>
+            </w:tcMar>
+            <w:shd w:fill="FFFFFF"/>
+          </w:tcPr>
+          <w:p>
+            <w:r/>
+            <w:r>
+              <w:rPr>
+                <w:b w:val="0"/>
+              </w:rPr>
+              <w:t>Positions with iloc</w:t>
+            </w:r>
+          </w:p>
+        </w:tc>
+        <w:tc>
+          <w:tcPr>
+            <w:tcW w:type="dxa" w:w="4824"/>
+            <w:vAlign w:val="center"/>
+            <w:tcMar>
+              <w:top w:w="90" w:type="dxa"/>
+              <w:left w:w="90" w:type="dxa"/>
+              <w:bottom w:w="90" w:type="dxa"/>
+              <w:right w:w="90" w:type="dxa"/>
+            </w:tcMar>
+            <w:shd w:fill="FFFFFF"/>
+          </w:tcPr>
+          <w:p>
+            <w:r/>
+            <w:r>
+              <w:rPr>
+                <w:b w:val="0"/>
+              </w:rPr>
+              <w:t>books.iloc[1:4, 0:3]</w:t>
+            </w:r>
+          </w:p>
+        </w:tc>
+        <w:tc>
+          <w:tcPr>
+            <w:tcW w:type="dxa" w:w="3528"/>
+            <w:vAlign w:val="center"/>
+            <w:tcMar>
+              <w:top w:w="90" w:type="dxa"/>
+              <w:left w:w="90" w:type="dxa"/>
+              <w:bottom w:w="90" w:type="dxa"/>
+              <w:right w:w="90" w:type="dxa"/>
+            </w:tcMar>
+            <w:shd w:fill="FFFFFF"/>
+          </w:tcPr>
+          <w:p>
+            <w:r/>
+            <w:r>
+              <w:rPr>
+                <w:b w:val="0"/>
+              </w:rPr>
+              <w:t>Stop positions excluded</w:t>
+            </w:r>
+          </w:p>
+        </w:tc>
+      </w:tr>
+    </w:tbl>
+    <w:p>
+      <w:r>
+        <w:t>Use .loc[] when you are selecting by row or column labels. Use .iloc[] when you are selecting by integer position. With .loc[1:3], label 3 is included. With .iloc[1:4], position 4 is excluded.</w:t>
+      </w:r>
+    </w:p>
+    <w:p>
+      <w:pPr>
+        <w:pStyle w:val="Heading1"/>
+      </w:pPr>
+      <w:r>
+        <w:t>7 Chain Commands</w:t>
+      </w:r>
+    </w:p>
+    <w:p>
+      <w:r>
+        <w:t>You can perform several steps in one statement. Read chained commands from left to right: first select the rows, then select the column, and finally calculate the mean.</w:t>
+      </w:r>
+    </w:p>
+    <w:p>
+      <w:pPr>
+        <w:spacing w:after="80"/>
+        <w:ind w:left="360"/>
+      </w:pPr>
+      <w:r>
+        <w:rPr>
+          <w:rFonts w:ascii="Consolas" w:hAnsi="Consolas"/>
+          <w:sz w:val="19"/>
+        </w:rPr>
+        <w:t>books.iloc[:4]["Pages"].mean()</w:t>
+      </w:r>
+    </w:p>
+    <w:p>
+      <w:pPr>
+        <w:pStyle w:val="Heading1"/>
+      </w:pPr>
+      <w:r>
+        <w:t>8 Arithmetic and New Columns</w:t>
+      </w:r>
+    </w:p>
+    <w:p>
+      <w:r>
+        <w:t>Pandas performs column arithmetic element by element. The following unrelated example calculates a discounted price for every book:</w:t>
+      </w:r>
+    </w:p>
+    <w:p>
+      <w:pPr>
+        <w:spacing w:after="80"/>
+        <w:ind w:left="360"/>
+      </w:pPr>
+      <w:r>
+        <w:rPr>
+          <w:rFonts w:ascii="Consolas" w:hAnsi="Consolas"/>
+          <w:sz w:val="19"/>
+        </w:rPr>
+        <w:t>books["Sale_Price"] = books["Price"] * 0.90</w:t>
+      </w:r>
+    </w:p>
+    <w:p>
+      <w:r>
+        <w:t>If a value in Price is missing, the calculated value in Sale_Price will also be missing. Pandas normally displays a missing numeric value as NaN.</w:t>
+      </w:r>
+    </w:p>
+    <w:p>
+      <w:pPr>
+        <w:pStyle w:val="Heading1"/>
+      </w:pPr>
+      <w:r>
+        <w:t>9 Sort Data</w:t>
+      </w:r>
+    </w:p>
+    <w:p>
+      <w:pPr>
+        <w:spacing w:after="80"/>
+        <w:ind w:left="360"/>
+      </w:pPr>
+      <w:r>
+        <w:rPr>
+          <w:rFonts w:ascii="Consolas" w:hAnsi="Consolas"/>
+          <w:sz w:val="19"/>
+        </w:rPr>
+        <w:t>sorted_books = books.sort_values("Pages", ascending=False)</w:t>
+      </w:r>
+    </w:p>
+    <w:p>
+      <w:r>
+        <w:t>ascending=False sorts from highest to lowest. Saving the result in a new variable keeps the original DataFrame unchanged. Using inplace=True would instead change the original DataFrame.</w:t>
+      </w:r>
+    </w:p>
+    <w:p>
+      <w:pPr>
+        <w:pStyle w:val="Heading1"/>
+      </w:pPr>
+      <w:r>
+        <w:t>10 Comparisons Masks and Filters</w:t>
+      </w:r>
+    </w:p>
+    <w:p>
+      <w:r>
+        <w:t>A comparison produces a Boolean Series containing True or False for every row. This is called a mask. Applying the mask keeps only rows where the value is True.</w:t>
+      </w:r>
+    </w:p>
+    <w:p>
+      <w:pPr>
+        <w:spacing w:after="80"/>
+        <w:ind w:left="360"/>
+      </w:pPr>
+      <w:r>
+        <w:rPr>
+          <w:rFonts w:ascii="Consolas" w:hAnsi="Consolas"/>
+          <w:sz w:val="19"/>
+        </w:rPr>
+        <w:t>mask = books["Rating"] &gt;= 4.5</w:t>
+      </w:r>
+    </w:p>
+    <w:p>
+      <w:pPr>
+        <w:spacing w:after="80"/>
+        <w:ind w:left="360"/>
+      </w:pPr>
+      <w:r>
+        <w:rPr>
+          <w:rFonts w:ascii="Consolas" w:hAnsi="Consolas"/>
+          <w:sz w:val="19"/>
+        </w:rPr>
+        <w:t>books[mask]</w:t>
+      </w:r>
+    </w:p>
+    <w:p>
+      <w:r>
+        <w:t>For more than one condition, place each comparison in parentheses:</w:t>
+      </w:r>
+    </w:p>
+    <w:p>
+      <w:pPr>
+        <w:spacing w:after="80"/>
+        <w:ind w:left="360"/>
+      </w:pPr>
+      <w:r>
+        <w:rPr>
+          <w:rFonts w:ascii="Consolas" w:hAnsi="Consolas"/>
+          <w:sz w:val="19"/>
+        </w:rPr>
+        <w:t>books[(books["Genre"] == "Mystery") &amp; (books["Pages"] &gt;= 300)]</w:t>
+      </w:r>
+    </w:p>
+    <w:p>
+      <w:pPr>
+        <w:spacing w:after="80"/>
+        <w:ind w:left="360"/>
+      </w:pPr>
+      <w:r>
+        <w:rPr>
+          <w:rFonts w:ascii="Consolas" w:hAnsi="Consolas"/>
+          <w:sz w:val="19"/>
+        </w:rPr>
+        <w:t>books[(books["Genre"] == "Mystery") | (books["Genre"] == "History")]</w:t>
+      </w:r>
+    </w:p>
+    <w:p>
+      <w:pPr>
+        <w:spacing w:after="80"/>
+        <w:ind w:left="360"/>
+      </w:pPr>
+      <w:r>
+        <w:rPr>
+          <w:rFonts w:ascii="Consolas" w:hAnsi="Consolas"/>
+          <w:sz w:val="19"/>
+        </w:rPr>
+        <w:t>books[~(books["Format"] == "Digital")]</w:t>
+      </w:r>
+    </w:p>
+    <w:p>
+      <w:pPr>
+        <w:pStyle w:val="ListBullet"/>
+      </w:pPr>
+      <w:r>
+        <w:t>&amp; means AND. Both conditions must be True.</w:t>
+      </w:r>
+    </w:p>
+    <w:p>
+      <w:pPr>
+        <w:pStyle w:val="ListBullet"/>
+      </w:pPr>
+      <w:r>
+        <w:t>| means OR. At least one condition must be True.</w:t>
+      </w:r>
+    </w:p>
+    <w:p>
+      <w:pPr>
+        <w:pStyle w:val="ListBullet"/>
+      </w:pPr>
+      <w:r>
+        <w:t>~ means NOT. It reverses True and False.</w:t>
+      </w:r>
+    </w:p>
+    <w:p>
+      <w:pPr>
+        <w:pStyle w:val="Heading1"/>
+      </w:pPr>
+      <w:r>
+        <w:t>Common Mistakes to Avoid</w:t>
+      </w:r>
+    </w:p>
+    <w:tbl>
+      <w:tblPr>
+        <w:tblW w:type="auto" w:w="0"/>
+        <w:tblLayout w:type="fixed"/>
+        <w:tblLook w:firstColumn="1" w:firstRow="1" w:lastColumn="0" w:lastRow="0" w:noHBand="0" w:noVBand="1" w:val="04A0"/>
+      </w:tblPr>
+      <w:tblGrid>
+        <w:gridCol w:w="3816"/>
+        <w:gridCol w:w="6264"/>
+      </w:tblGrid>
+      <w:tr>
+        <w:trPr>
+          <w:cantSplit/>
+          <w:tblHeader/>
+        </w:trPr>
+        <w:tc>
+          <w:tcPr>
+            <w:tcW w:type="dxa" w:w="5040"/>
+            <w:vAlign w:val="center"/>
+            <w:tcMar>
+              <w:top w:w="90" w:type="dxa"/>
+              <w:left w:w="90" w:type="dxa"/>
+              <w:bottom w:w="90" w:type="dxa"/>
+              <w:right w:w="90" w:type="dxa"/>
+            </w:tcMar>
+            <w:shd w:fill="1F4E78"/>
+          </w:tcPr>
+          <w:p>
+            <w:r/>
+            <w:r>
+              <w:rPr>
+                <w:b/>
+                <w:color w:val="FFFFFF"/>
+              </w:rPr>
+              <w:t>Mistake</w:t>
+            </w:r>
+          </w:p>
+        </w:tc>
+        <w:tc>
+          <w:tcPr>
+            <w:tcW w:type="dxa" w:w="5040"/>
+            <w:vAlign w:val="center"/>
+            <w:tcMar>
+              <w:top w:w="90" w:type="dxa"/>
+              <w:left w:w="90" w:type="dxa"/>
+              <w:bottom w:w="90" w:type="dxa"/>
+              <w:right w:w="90" w:type="dxa"/>
+            </w:tcMar>
+            <w:shd w:fill="1F4E78"/>
+          </w:tcPr>
+          <w:p>
+            <w:r/>
+            <w:r>
+              <w:rPr>
+                <w:b/>
+                <w:color w:val="FFFFFF"/>
+              </w:rPr>
+              <w:t>Correction</w:t>
+            </w:r>
+          </w:p>
+        </w:tc>
+      </w:tr>
+      <w:tr>
+        <w:trPr>
+          <w:cantSplit/>
+        </w:trPr>
+        <w:tc>
+          <w:tcPr>
+            <w:tcW w:type="dxa" w:w="3816"/>
+            <w:vAlign w:val="center"/>
+            <w:tcMar>
+              <w:top w:w="90" w:type="dxa"/>
+              <w:left w:w="90" w:type="dxa"/>
+              <w:bottom w:w="90" w:type="dxa"/>
+              <w:right w:w="90" w:type="dxa"/>
+            </w:tcMar>
+            <w:shd w:fill="EAF2F8"/>
+          </w:tcPr>
+          <w:p>
+            <w:r/>
+            <w:r>
+              <w:rPr>
+                <w:b w:val="0"/>
+              </w:rPr>
+              <w:t>Writing df.shape()</w:t>
+            </w:r>
+          </w:p>
+        </w:tc>
+        <w:tc>
+          <w:tcPr>
+            <w:tcW w:type="dxa" w:w="6264"/>
+            <w:vAlign w:val="center"/>
+            <w:tcMar>
+              <w:top w:w="90" w:type="dxa"/>
+              <w:left w:w="90" w:type="dxa"/>
+              <w:bottom w:w="90" w:type="dxa"/>
+              <w:right w:w="90" w:type="dxa"/>
+            </w:tcMar>
+            <w:shd w:fill="EAF2F8"/>
+          </w:tcPr>
+          <w:p>
+            <w:r/>
+            <w:r>
+              <w:rPr>
+                <w:b w:val="0"/>
+              </w:rPr>
+              <w:t>shape is an attribute. Use df.shape.</w:t>
+            </w:r>
+          </w:p>
+        </w:tc>
+      </w:tr>
+      <w:tr>
+        <w:trPr>
+          <w:cantSplit/>
+        </w:trPr>
+        <w:tc>
+          <w:tcPr>
+            <w:tcW w:type="dxa" w:w="3816"/>
+            <w:vAlign w:val="center"/>
+            <w:tcMar>
+              <w:top w:w="90" w:type="dxa"/>
+              <w:left w:w="90" w:type="dxa"/>
+              <w:bottom w:w="90" w:type="dxa"/>
+              <w:right w:w="90" w:type="dxa"/>
+            </w:tcMar>
+            <w:shd w:fill="FFFFFF"/>
+          </w:tcPr>
+          <w:p>
+            <w:r/>
+            <w:r>
+              <w:rPr>
+                <w:b w:val="0"/>
+              </w:rPr>
+              <w:t>Using one pair of brackets for several columns</w:t>
+            </w:r>
+          </w:p>
+        </w:tc>
+        <w:tc>
+          <w:tcPr>
+            <w:tcW w:type="dxa" w:w="6264"/>
+            <w:vAlign w:val="center"/>
+            <w:tcMar>
+              <w:top w:w="90" w:type="dxa"/>
+              <w:left w:w="90" w:type="dxa"/>
+              <w:bottom w:w="90" w:type="dxa"/>
+              <w:right w:w="90" w:type="dxa"/>
+            </w:tcMar>
+            <w:shd w:fill="FFFFFF"/>
+          </w:tcPr>
+          <w:p>
+            <w:r/>
+            <w:r>
+              <w:rPr>
+                <w:b w:val="0"/>
+              </w:rPr>
+              <w:t>Use df[["Column1", "Column2"]].</w:t>
+            </w:r>
+          </w:p>
+        </w:tc>
+      </w:tr>
+      <w:tr>
+        <w:trPr>
+          <w:cantSplit/>
+        </w:trPr>
+        <w:tc>
+          <w:tcPr>
+            <w:tcW w:type="dxa" w:w="3816"/>
+            <w:vAlign w:val="center"/>
+            <w:tcMar>
+              <w:top w:w="90" w:type="dxa"/>
+              <w:left w:w="90" w:type="dxa"/>
+              <w:bottom w:w="90" w:type="dxa"/>
+              <w:right w:w="90" w:type="dxa"/>
+            </w:tcMar>
+            <w:shd w:fill="EAF2F8"/>
+          </w:tcPr>
+          <w:p>
+            <w:r/>
+            <w:r>
+              <w:rPr>
+                <w:b w:val="0"/>
+              </w:rPr>
+              <w:t>Expecting iloc to include the stop</w:t>
+            </w:r>
+          </w:p>
+        </w:tc>
+        <w:tc>
+          <w:tcPr>
+            <w:tcW w:type="dxa" w:w="6264"/>
+            <w:vAlign w:val="center"/>
+            <w:tcMar>
+              <w:top w:w="90" w:type="dxa"/>
+              <w:left w:w="90" w:type="dxa"/>
+              <w:bottom w:w="90" w:type="dxa"/>
+              <w:right w:w="90" w:type="dxa"/>
+            </w:tcMar>
+            <w:shd w:fill="EAF2F8"/>
+          </w:tcPr>
+          <w:p>
+            <w:r/>
+            <w:r>
+              <w:rPr>
+                <w:b w:val="0"/>
+              </w:rPr>
+              <w:t>The stop position is excluded.</w:t>
+            </w:r>
+          </w:p>
+        </w:tc>
+      </w:tr>
+      <w:tr>
+        <w:trPr>
+          <w:cantSplit/>
+        </w:trPr>
+        <w:tc>
+          <w:tcPr>
+            <w:tcW w:type="dxa" w:w="3816"/>
+            <w:vAlign w:val="center"/>
+            <w:tcMar>
+              <w:top w:w="90" w:type="dxa"/>
+              <w:left w:w="90" w:type="dxa"/>
+              <w:bottom w:w="90" w:type="dxa"/>
+              <w:right w:w="90" w:type="dxa"/>
+            </w:tcMar>
+            <w:shd w:fill="FFFFFF"/>
+          </w:tcPr>
+          <w:p>
+            <w:r/>
+            <w:r>
+              <w:rPr>
+                <w:b w:val="0"/>
+              </w:rPr>
+              <w:t>Using and or or with pandas Series</w:t>
+            </w:r>
+          </w:p>
+        </w:tc>
+        <w:tc>
+          <w:tcPr>
+            <w:tcW w:type="dxa" w:w="6264"/>
+            <w:vAlign w:val="center"/>
+            <w:tcMar>
+              <w:top w:w="90" w:type="dxa"/>
+              <w:left w:w="90" w:type="dxa"/>
+              <w:bottom w:w="90" w:type="dxa"/>
+              <w:right w:w="90" w:type="dxa"/>
+            </w:tcMar>
+            <w:shd w:fill="FFFFFF"/>
+          </w:tcPr>
+          <w:p>
+            <w:r/>
+            <w:r>
+              <w:rPr>
+                <w:b w:val="0"/>
+              </w:rPr>
+              <w:t>Use &amp; and | with parentheses.</w:t>
+            </w:r>
+          </w:p>
+        </w:tc>
+      </w:tr>
+      <w:tr>
+        <w:trPr>
+          <w:cantSplit/>
+        </w:trPr>
+        <w:tc>
+          <w:tcPr>
+            <w:tcW w:type="dxa" w:w="3816"/>
+            <w:vAlign w:val="center"/>
+            <w:tcMar>
+              <w:top w:w="90" w:type="dxa"/>
+              <w:left w:w="90" w:type="dxa"/>
+              <w:bottom w:w="90" w:type="dxa"/>
+              <w:right w:w="90" w:type="dxa"/>
+            </w:tcMar>
+            <w:shd w:fill="EAF2F8"/>
+          </w:tcPr>
+          <w:p>
+            <w:r/>
+            <w:r>
+              <w:rPr>
+                <w:b w:val="0"/>
+              </w:rPr>
+              <w:t>FileNotFoundError</w:t>
+            </w:r>
+          </w:p>
+        </w:tc>
+        <w:tc>
+          <w:tcPr>
+            <w:tcW w:type="dxa" w:w="6264"/>
+            <w:vAlign w:val="center"/>
+            <w:tcMar>
+              <w:top w:w="90" w:type="dxa"/>
+              <w:left w:w="90" w:type="dxa"/>
+              <w:bottom w:w="90" w:type="dxa"/>
+              <w:right w:w="90" w:type="dxa"/>
+            </w:tcMar>
+            <w:shd w:fill="EAF2F8"/>
+          </w:tcPr>
+          <w:p>
+            <w:r/>
+            <w:r>
+              <w:rPr>
+                <w:b w:val="0"/>
+              </w:rPr>
+              <w:t>Check that the Excel file is in the same folder and that its name matches exactly.</w:t>
+            </w:r>
+          </w:p>
+        </w:tc>
+      </w:tr>
+      <w:tr>
+        <w:trPr>
+          <w:cantSplit/>
+        </w:trPr>
+        <w:tc>
+          <w:tcPr>
+            <w:tcW w:type="dxa" w:w="3816"/>
+            <w:vAlign w:val="center"/>
+            <w:tcMar>
+              <w:top w:w="90" w:type="dxa"/>
+              <w:left w:w="90" w:type="dxa"/>
+              <w:bottom w:w="90" w:type="dxa"/>
+              <w:right w:w="90" w:type="dxa"/>
+            </w:tcMar>
+            <w:shd w:fill="FFFFFF"/>
+          </w:tcPr>
+          <w:p>
+            <w:r/>
+            <w:r>
+              <w:rPr>
+                <w:b w:val="0"/>
+              </w:rPr>
+              <w:t>Ignoring NaN values</w:t>
+            </w:r>
+          </w:p>
+        </w:tc>
+        <w:tc>
+          <w:tcPr>
+            <w:tcW w:type="dxa" w:w="6264"/>
+            <w:vAlign w:val="center"/>
+            <w:tcMar>
+              <w:top w:w="90" w:type="dxa"/>
+              <w:left w:w="90" w:type="dxa"/>
+              <w:bottom w:w="90" w:type="dxa"/>
+              <w:right w:w="90" w:type="dxa"/>
+            </w:tcMar>
+            <w:shd w:fill="FFFFFF"/>
+          </w:tcPr>
+          <w:p>
+            <w:r/>
+            <w:r>
+              <w:rPr>
+                <w:b w:val="0"/>
+              </w:rPr>
+              <w:t>Use info() to find columns with missing data.</w:t>
             </w:r>
           </w:p>
         </w:tc>
@@ -221,98 +1532,71 @@
         <w:pStyle w:val="Heading1"/>
       </w:pPr>
       <w:r>
-        <w:t>3. Load and Inspect Data</w:t>
+        <w:t>Check Your Understanding</w:t>
       </w:r>
     </w:p>
     <w:p>
+      <w:pPr>
+        <w:spacing w:after="60"/>
+      </w:pPr>
       <w:r>
-        <w:t>Start with these commands and ask students to predict the type of output before running each one:</w:t>
+        <w:t>1. What is the difference between a Series and a DataFrame?</w:t>
       </w:r>
     </w:p>
     <w:p>
+      <w:pPr>
+        <w:spacing w:after="60"/>
+      </w:pPr>
       <w:r>
-        <w:rPr>
-          <w:rFonts w:ascii="Consolas" w:hAnsi="Consolas"/>
-          <w:sz w:val="19"/>
-        </w:rPr>
-        <w:t>import pandas as pd</w:t>
+        <w:t>2. Why is shape written without parentheses?</w:t>
       </w:r>
     </w:p>
     <w:p>
+      <w:pPr>
+        <w:spacing w:after="60"/>
+      </w:pPr>
       <w:r>
-        <w:rPr>
-          <w:rFonts w:ascii="Consolas" w:hAnsi="Consolas"/>
-          <w:sz w:val="19"/>
-        </w:rPr>
-        <w:t>df = pd.read_excel("CampusWorkshopData.xlsx")</w:t>
+        <w:t>3. Which command would count how many books belong to each genre?</w:t>
       </w:r>
     </w:p>
     <w:p>
+      <w:pPr>
+        <w:spacing w:after="60"/>
+      </w:pPr>
       <w:r>
-        <w:rPr>
-          <w:rFonts w:ascii="Consolas" w:hAnsi="Consolas"/>
-          <w:sz w:val="19"/>
-        </w:rPr>
-        <w:t>df.head()</w:t>
+        <w:t>4. When would you use .loc[] instead of .iloc[]?</w:t>
       </w:r>
     </w:p>
     <w:p>
+      <w:pPr>
+        <w:spacing w:after="60"/>
+      </w:pPr>
       <w:r>
-        <w:rPr>
-          <w:rFonts w:ascii="Consolas" w:hAnsi="Consolas"/>
-          <w:sz w:val="19"/>
-        </w:rPr>
-        <w:t>df.tail(3)</w:t>
+        <w:t>5. Why does .loc[2:5] include label 5 while .iloc[2:5] excludes position 5?</w:t>
       </w:r>
     </w:p>
     <w:p>
+      <w:pPr>
+        <w:spacing w:after="60"/>
+      </w:pPr>
       <w:r>
-        <w:rPr>
-          <w:rFonts w:ascii="Consolas" w:hAnsi="Consolas"/>
-          <w:sz w:val="19"/>
-        </w:rPr>
-        <w:t>df.shape</w:t>
+        <w:t>6. What values are stored in a Boolean mask?</w:t>
       </w:r>
     </w:p>
     <w:p>
+      <w:pPr>
+        <w:spacing w:after="60"/>
+      </w:pPr>
       <w:r>
-        <w:rPr>
-          <w:rFonts w:ascii="Consolas" w:hAnsi="Consolas"/>
-          <w:sz w:val="19"/>
-        </w:rPr>
-        <w:t>df.sample(4, random_state=3)</w:t>
+        <w:t>7. Why might a calculated column contain NaN?</w:t>
       </w:r>
     </w:p>
     <w:p>
+      <w:pPr>
+        <w:spacing w:after="60"/>
+      </w:pPr>
       <w:r>
-        <w:rPr>
-          <w:rFonts w:ascii="Consolas" w:hAnsi="Consolas"/>
-          <w:sz w:val="19"/>
-        </w:rPr>
-        <w:t>df.columns</w:t>
-      </w:r>
-    </w:p>
-    <w:p>
-      <w:r>
-        <w:rPr>
-          <w:rFonts w:ascii="Consolas" w:hAnsi="Consolas"/>
-          <w:sz w:val="19"/>
-        </w:rPr>
-        <w:t>df.dtypes</w:t>
-      </w:r>
-    </w:p>
-    <w:p>
-      <w:r>
-        <w:rPr>
-          <w:rFonts w:ascii="Consolas" w:hAnsi="Consolas"/>
-          <w:sz w:val="19"/>
-        </w:rPr>
-        <w:t>df.info()</w:t>
-      </w:r>
-    </w:p>
-    <w:p>
-      <w:r>
-        <w:t>Key distinction: shape is an attribute, so it has no parentheses. head(), tail(), sample(), and info() are methods, so they use parentheses.</w:t>
+        <w:t>8. What is the difference between &amp; and | in a filter?</w:t>
       </w:r>
     </w:p>
     <w:p>
@@ -320,674 +1604,55 @@
         <w:pStyle w:val="Heading1"/>
       </w:pPr>
       <w:r>
-        <w:t>4. Summarize Numerical and Categorical Data</w:t>
-      </w:r>
-    </w:p>
-    <w:p>
-      <w:r>
-        <w:t>Numerical example:</w:t>
-      </w:r>
-    </w:p>
-    <w:p>
-      <w:r>
-        <w:rPr>
-          <w:rFonts w:ascii="Consolas" w:hAnsi="Consolas"/>
-          <w:sz w:val="19"/>
-        </w:rPr>
-        <w:t>df["Attended"].mean()</w:t>
-      </w:r>
-    </w:p>
-    <w:p>
-      <w:r>
-        <w:rPr>
-          <w:rFonts w:ascii="Consolas" w:hAnsi="Consolas"/>
-          <w:sz w:val="19"/>
-        </w:rPr>
-        <w:t>df["Attended"].median()</w:t>
-      </w:r>
-    </w:p>
-    <w:p>
-      <w:r>
-        <w:rPr>
-          <w:rFonts w:ascii="Consolas" w:hAnsi="Consolas"/>
-          <w:sz w:val="19"/>
-        </w:rPr>
-        <w:t>df["Attended"].min()</w:t>
-      </w:r>
-    </w:p>
-    <w:p>
-      <w:r>
-        <w:rPr>
-          <w:rFonts w:ascii="Consolas" w:hAnsi="Consolas"/>
-          <w:sz w:val="19"/>
-        </w:rPr>
-        <w:t>df["Attended"].max()</w:t>
-      </w:r>
-    </w:p>
-    <w:p>
-      <w:r>
-        <w:rPr>
-          <w:rFonts w:ascii="Consolas" w:hAnsi="Consolas"/>
-          <w:sz w:val="19"/>
-        </w:rPr>
-        <w:t>df.describe()</w:t>
-      </w:r>
-    </w:p>
-    <w:p>
-      <w:r>
-        <w:t>Categorical example:</w:t>
-      </w:r>
-    </w:p>
-    <w:p>
-      <w:r>
-        <w:rPr>
-          <w:rFonts w:ascii="Consolas" w:hAnsi="Consolas"/>
-          <w:sz w:val="19"/>
-        </w:rPr>
-        <w:t>df["Category"].unique()</w:t>
-      </w:r>
-    </w:p>
-    <w:p>
-      <w:r>
-        <w:rPr>
-          <w:rFonts w:ascii="Consolas" w:hAnsi="Consolas"/>
-          <w:sz w:val="19"/>
-        </w:rPr>
-        <w:t>df["Category"].value_counts()</w:t>
-      </w:r>
-    </w:p>
-    <w:p>
-      <w:r>
-        <w:t>Ask: Why does describe() focus mainly on numerical columns? Why is value_counts() more useful for categories?</w:t>
+        <w:t>Before Starting the Lab</w:t>
       </w:r>
     </w:p>
     <w:p>
       <w:pPr>
-        <w:pStyle w:val="Heading1"/>
+        <w:pStyle w:val="ListBullet"/>
       </w:pPr>
       <w:r>
-        <w:t>5. Selecting Data</w:t>
-      </w:r>
-    </w:p>
-    <w:tbl>
-      <w:tblPr>
-        <w:tblStyle w:val="LightShading-Accent1"/>
-        <w:tblW w:type="auto" w:w="0"/>
-        <w:tblLook w:firstColumn="1" w:firstRow="1" w:lastColumn="0" w:lastRow="0" w:noHBand="0" w:noVBand="1" w:val="04A0"/>
-      </w:tblPr>
-      <w:tblGrid>
-        <w:gridCol w:w="3360"/>
-        <w:gridCol w:w="3360"/>
-        <w:gridCol w:w="3360"/>
-      </w:tblGrid>
-      <w:tr>
-        <w:tc>
-          <w:tcPr>
-            <w:tcW w:type="dxa" w:w="3360"/>
-          </w:tcPr>
-          <w:p>
-            <w:r>
-              <w:t>Goal</w:t>
-            </w:r>
-          </w:p>
-        </w:tc>
-        <w:tc>
-          <w:tcPr>
-            <w:tcW w:type="dxa" w:w="3360"/>
-          </w:tcPr>
-          <w:p>
-            <w:r>
-              <w:t>Command</w:t>
-            </w:r>
-          </w:p>
-        </w:tc>
-        <w:tc>
-          <w:tcPr>
-            <w:tcW w:type="dxa" w:w="3360"/>
-          </w:tcPr>
-          <w:p>
-            <w:r>
-              <w:t>Important Detail</w:t>
-            </w:r>
-          </w:p>
-        </w:tc>
-      </w:tr>
-      <w:tr>
-        <w:tc>
-          <w:tcPr>
-            <w:tcW w:type="dxa" w:w="3360"/>
-          </w:tcPr>
-          <w:p>
-            <w:r>
-              <w:t>One column</w:t>
-            </w:r>
-          </w:p>
-        </w:tc>
-        <w:tc>
-          <w:tcPr>
-            <w:tcW w:type="dxa" w:w="3360"/>
-          </w:tcPr>
-          <w:p>
-            <w:r>
-              <w:t>df["Workshop"]</w:t>
-            </w:r>
-          </w:p>
-        </w:tc>
-        <w:tc>
-          <w:tcPr>
-            <w:tcW w:type="dxa" w:w="3360"/>
-          </w:tcPr>
-          <w:p>
-            <w:r>
-              <w:t>Returns a Series</w:t>
-            </w:r>
-          </w:p>
-        </w:tc>
-      </w:tr>
-      <w:tr>
-        <w:tc>
-          <w:tcPr>
-            <w:tcW w:type="dxa" w:w="3360"/>
-          </w:tcPr>
-          <w:p>
-            <w:r>
-              <w:t>Several columns</w:t>
-            </w:r>
-          </w:p>
-        </w:tc>
-        <w:tc>
-          <w:tcPr>
-            <w:tcW w:type="dxa" w:w="3360"/>
-          </w:tcPr>
-          <w:p>
-            <w:r>
-              <w:t>df[["Workshop", "Category"]]</w:t>
-            </w:r>
-          </w:p>
-        </w:tc>
-        <w:tc>
-          <w:tcPr>
-            <w:tcW w:type="dxa" w:w="3360"/>
-          </w:tcPr>
-          <w:p>
-            <w:r>
-              <w:t>Returns a DataFrame</w:t>
-            </w:r>
-          </w:p>
-        </w:tc>
-      </w:tr>
-      <w:tr>
-        <w:tc>
-          <w:tcPr>
-            <w:tcW w:type="dxa" w:w="3360"/>
-          </w:tcPr>
-          <w:p>
-            <w:r>
-              <w:t>Labels</w:t>
-            </w:r>
-          </w:p>
-        </w:tc>
-        <w:tc>
-          <w:tcPr>
-            <w:tcW w:type="dxa" w:w="3360"/>
-          </w:tcPr>
-          <w:p>
-            <w:r>
-              <w:t>df.loc[2:5, "Workshop":"Attended"]</w:t>
-            </w:r>
-          </w:p>
-        </w:tc>
-        <w:tc>
-          <w:tcPr>
-            <w:tcW w:type="dxa" w:w="3360"/>
-          </w:tcPr>
-          <w:p>
-            <w:r>
-              <w:t>Ending labels are included</w:t>
-            </w:r>
-          </w:p>
-        </w:tc>
-      </w:tr>
-      <w:tr>
-        <w:tc>
-          <w:tcPr>
-            <w:tcW w:type="dxa" w:w="3360"/>
-          </w:tcPr>
-          <w:p>
-            <w:r>
-              <w:t>Positions</w:t>
-            </w:r>
-          </w:p>
-        </w:tc>
-        <w:tc>
-          <w:tcPr>
-            <w:tcW w:type="dxa" w:w="3360"/>
-          </w:tcPr>
-          <w:p>
-            <w:r>
-              <w:t>df.iloc[0:4, 1:4]</w:t>
-            </w:r>
-          </w:p>
-        </w:tc>
-        <w:tc>
-          <w:tcPr>
-            <w:tcW w:type="dxa" w:w="3360"/>
-          </w:tcPr>
-          <w:p>
-            <w:r>
-              <w:t>Stop positions are excluded</w:t>
-            </w:r>
-          </w:p>
-        </w:tc>
-      </w:tr>
-    </w:tbl>
-    <w:p>
-      <w:r>
-        <w:t>Quick check: .loc[] uses labels or names; .iloc[] uses integer positions. Ask students what rows they expect before executing each command.</w:t>
+        <w:t>Keep PandasIntro.ipynb and CampusWorkshopData.xlsx in the same folder.</w:t>
       </w:r>
     </w:p>
     <w:p>
       <w:pPr>
-        <w:pStyle w:val="Heading1"/>
+        <w:pStyle w:val="ListBullet"/>
       </w:pPr>
       <w:r>
-        <w:t>6. Arithmetic and New Columns</w:t>
-      </w:r>
-    </w:p>
-    <w:p>
-      <w:r>
-        <w:t>Pandas performs arithmetic element by element. One calculation can therefore operate on an entire column:</w:t>
-      </w:r>
-    </w:p>
-    <w:p>
-      <w:r>
-        <w:rPr>
-          <w:rFonts w:ascii="Consolas" w:hAnsi="Consolas"/>
-          <w:sz w:val="19"/>
-        </w:rPr>
-        <w:t>df["Attendance_Rate"] = (df["Attended"] / df["Registered"] * 100).round(1)</w:t>
-      </w:r>
-    </w:p>
-    <w:p>
-      <w:r>
-        <w:t>Walk through one row by hand first: attended divided by registered gives a proportion; multiplying by 100 converts it to a percentage. A missing attended value produces a missing attendance rate instead of crashing the calculation.</w:t>
+        <w:t>Select the correct Python kernel in Visual Studio Code.</w:t>
       </w:r>
     </w:p>
     <w:p>
       <w:pPr>
-        <w:pStyle w:val="Heading1"/>
+        <w:pStyle w:val="ListBullet"/>
       </w:pPr>
       <w:r>
-        <w:t>7. Sorting and Filtering</w:t>
-      </w:r>
-    </w:p>
-    <w:p>
-      <w:r>
-        <w:rPr>
-          <w:rFonts w:ascii="Consolas" w:hAnsi="Consolas"/>
-          <w:sz w:val="19"/>
-        </w:rPr>
-        <w:t>df.sort_values("Registered", ascending=False)</w:t>
-      </w:r>
-    </w:p>
-    <w:p>
-      <w:r>
-        <w:rPr>
-          <w:rFonts w:ascii="Consolas" w:hAnsi="Consolas"/>
-          <w:sz w:val="19"/>
-        </w:rPr>
-        <w:t>mask = df["Satisfaction"] &gt;= 4.5</w:t>
-      </w:r>
-    </w:p>
-    <w:p>
-      <w:r>
-        <w:rPr>
-          <w:rFonts w:ascii="Consolas" w:hAnsi="Consolas"/>
-          <w:sz w:val="19"/>
-        </w:rPr>
-        <w:t>df[mask]</w:t>
-      </w:r>
-    </w:p>
-    <w:p>
-      <w:r>
-        <w:rPr>
-          <w:rFonts w:ascii="Consolas" w:hAnsi="Consolas"/>
-          <w:sz w:val="19"/>
-        </w:rPr>
-        <w:t>df[(df["Delivery_Mode"] == "In Person") &amp; (df["Attended"] &gt;= 20)]</w:t>
-      </w:r>
-    </w:p>
-    <w:p>
-      <w:r>
-        <w:rPr>
-          <w:rFonts w:ascii="Consolas" w:hAnsi="Consolas"/>
-          <w:sz w:val="19"/>
-        </w:rPr>
-        <w:t>df[(df["Category"] == "Programming") | (df["Category"] == "Data Science")]</w:t>
-      </w:r>
-    </w:p>
-    <w:p>
-      <w:r>
-        <w:rPr>
-          <w:rFonts w:ascii="Consolas" w:hAnsi="Consolas"/>
-          <w:sz w:val="19"/>
-        </w:rPr>
-        <w:t>df[~(df["Delivery_Mode"] == "Online")]</w:t>
-      </w:r>
-    </w:p>
-    <w:p>
-      <w:r>
-        <w:t>Important: use &amp;, |, and ~ with pandas comparisons. Put each comparison inside parentheses. A Boolean mask contains True or False for every row; only True rows remain after filtering.</w:t>
+        <w:t>Run cells from the top of the notebook in order.</w:t>
       </w:r>
     </w:p>
     <w:p>
       <w:pPr>
-        <w:pStyle w:val="Heading1"/>
+        <w:pStyle w:val="ListBullet"/>
       </w:pPr>
       <w:r>
-        <w:t>8. Suggested Live Demonstration</w:t>
+        <w:t>Read the output after every command instead of immediately moving on.</w:t>
       </w:r>
     </w:p>
     <w:p>
       <w:pPr>
-        <w:pStyle w:val="ListNumber"/>
+        <w:pStyle w:val="ListBullet"/>
       </w:pPr>
       <w:r>
-        <w:t>Open the Excel file and identify rows, columns, numeric fields, categorical fields, and missing values.</w:t>
+        <w:t>Write your own code and make sure you can explain what each line does.</w:t>
       </w:r>
     </w:p>
     <w:p>
       <w:pPr>
-        <w:pStyle w:val="ListNumber"/>
+        <w:pStyle w:val="ListBullet"/>
       </w:pPr>
       <w:r>
-        <w:t>Load the file and compare the spreadsheet with df.head().</w:t>
-      </w:r>
-    </w:p>
-    <w:p>
-      <w:pPr>
-        <w:pStyle w:val="ListNumber"/>
-      </w:pPr>
-      <w:r>
-        <w:t>Ask students to predict df.shape before running it.</w:t>
-      </w:r>
-    </w:p>
-    <w:p>
-      <w:pPr>
-        <w:pStyle w:val="ListNumber"/>
-      </w:pPr>
-      <w:r>
-        <w:t>Select one column and two columns; compare Series and DataFrame output.</w:t>
-      </w:r>
-    </w:p>
-    <w:p>
-      <w:pPr>
-        <w:pStyle w:val="ListNumber"/>
-      </w:pPr>
-      <w:r>
-        <w:t>Calculate one summary statistic and one value count.</w:t>
-      </w:r>
-    </w:p>
-    <w:p>
-      <w:pPr>
-        <w:pStyle w:val="ListNumber"/>
-      </w:pPr>
-      <w:r>
-        <w:t>Demonstrate the difference between .loc[] and .iloc[].</w:t>
-      </w:r>
-    </w:p>
-    <w:p>
-      <w:pPr>
-        <w:pStyle w:val="ListNumber"/>
-      </w:pPr>
-      <w:r>
-        <w:t>Create Attendance_Rate and inspect the row with missing attendance.</w:t>
-      </w:r>
-    </w:p>
-    <w:p>
-      <w:pPr>
-        <w:pStyle w:val="ListNumber"/>
-      </w:pPr>
-      <w:r>
-        <w:t>Build a mask, print it, and then use it to filter the DataFrame.</w:t>
-      </w:r>
-    </w:p>
-    <w:p>
-      <w:r>
-        <w:br w:type="page"/>
-      </w:r>
-    </w:p>
-    <w:p>
-      <w:pPr>
-        <w:pStyle w:val="Heading1"/>
-      </w:pPr>
-      <w:r>
-        <w:t>9. Common Student Mistakes</w:t>
-      </w:r>
-    </w:p>
-    <w:tbl>
-      <w:tblPr>
-        <w:tblStyle w:val="LightShading-Accent1"/>
-        <w:tblW w:type="auto" w:w="0"/>
-        <w:tblLook w:firstColumn="1" w:firstRow="1" w:lastColumn="0" w:lastRow="0" w:noHBand="0" w:noVBand="1" w:val="04A0"/>
-      </w:tblPr>
-      <w:tblGrid>
-        <w:gridCol w:w="5040"/>
-        <w:gridCol w:w="5040"/>
-      </w:tblGrid>
-      <w:tr>
-        <w:tc>
-          <w:tcPr>
-            <w:tcW w:type="dxa" w:w="5040"/>
-          </w:tcPr>
-          <w:p>
-            <w:r>
-              <w:t>Mistake</w:t>
-            </w:r>
-          </w:p>
-        </w:tc>
-        <w:tc>
-          <w:tcPr>
-            <w:tcW w:type="dxa" w:w="5040"/>
-          </w:tcPr>
-          <w:p>
-            <w:r>
-              <w:t>Correction</w:t>
-            </w:r>
-          </w:p>
-        </w:tc>
-      </w:tr>
-      <w:tr>
-        <w:tc>
-          <w:tcPr>
-            <w:tcW w:type="dxa" w:w="5040"/>
-          </w:tcPr>
-          <w:p>
-            <w:r>
-              <w:t>Using curly quotation marks</w:t>
-            </w:r>
-          </w:p>
-        </w:tc>
-        <w:tc>
-          <w:tcPr>
-            <w:tcW w:type="dxa" w:w="5040"/>
-          </w:tcPr>
-          <w:p>
-            <w:r>
-              <w:t>Retype quotes as straight Python quotes.</w:t>
-            </w:r>
-          </w:p>
-        </w:tc>
-      </w:tr>
-      <w:tr>
-        <w:tc>
-          <w:tcPr>
-            <w:tcW w:type="dxa" w:w="5040"/>
-          </w:tcPr>
-          <w:p>
-            <w:r>
-              <w:t>Writing df.shape()</w:t>
-            </w:r>
-          </w:p>
-        </w:tc>
-        <w:tc>
-          <w:tcPr>
-            <w:tcW w:type="dxa" w:w="5040"/>
-          </w:tcPr>
-          <w:p>
-            <w:r>
-              <w:t>shape is an attribute: use df.shape.</w:t>
-            </w:r>
-          </w:p>
-        </w:tc>
-      </w:tr>
-      <w:tr>
-        <w:tc>
-          <w:tcPr>
-            <w:tcW w:type="dxa" w:w="5040"/>
-          </w:tcPr>
-          <w:p>
-            <w:r>
-              <w:t>Using one pair of brackets for multiple columns</w:t>
-            </w:r>
-          </w:p>
-        </w:tc>
-        <w:tc>
-          <w:tcPr>
-            <w:tcW w:type="dxa" w:w="5040"/>
-          </w:tcPr>
-          <w:p>
-            <w:r>
-              <w:t>Use a list inside the brackets: df[["A", "B"]].</w:t>
-            </w:r>
-          </w:p>
-        </w:tc>
-      </w:tr>
-      <w:tr>
-        <w:tc>
-          <w:tcPr>
-            <w:tcW w:type="dxa" w:w="5040"/>
-          </w:tcPr>
-          <w:p>
-            <w:r>
-              <w:t>Expecting .iloc[] to include the stop</w:t>
-            </w:r>
-          </w:p>
-        </w:tc>
-        <w:tc>
-          <w:tcPr>
-            <w:tcW w:type="dxa" w:w="5040"/>
-          </w:tcPr>
-          <w:p>
-            <w:r>
-              <w:t>Remind students that positional slicing excludes the stop.</w:t>
-            </w:r>
-          </w:p>
-        </w:tc>
-      </w:tr>
-      <w:tr>
-        <w:tc>
-          <w:tcPr>
-            <w:tcW w:type="dxa" w:w="5040"/>
-          </w:tcPr>
-          <w:p>
-            <w:r>
-              <w:t>Using and/or with pandas Series</w:t>
-            </w:r>
-          </w:p>
-        </w:tc>
-        <w:tc>
-          <w:tcPr>
-            <w:tcW w:type="dxa" w:w="5040"/>
-          </w:tcPr>
-          <w:p>
-            <w:r>
-              <w:t>Use &amp; and |, with each comparison in parentheses.</w:t>
-            </w:r>
-          </w:p>
-        </w:tc>
-      </w:tr>
-      <w:tr>
-        <w:tc>
-          <w:tcPr>
-            <w:tcW w:type="dxa" w:w="5040"/>
-          </w:tcPr>
-          <w:p>
-            <w:r>
-              <w:t>Excel file not found</w:t>
-            </w:r>
-          </w:p>
-        </w:tc>
-        <w:tc>
-          <w:tcPr>
-            <w:tcW w:type="dxa" w:w="5040"/>
-          </w:tcPr>
-          <w:p>
-            <w:r>
-              <w:t>Keep the notebook and Excel file in the same repository folder and verify the exact filename.</w:t>
-            </w:r>
-          </w:p>
-        </w:tc>
-      </w:tr>
-      <w:tr>
-        <w:tc>
-          <w:tcPr>
-            <w:tcW w:type="dxa" w:w="5040"/>
-          </w:tcPr>
-          <w:p>
-            <w:r>
-              <w:t>Ignoring missing values</w:t>
-            </w:r>
-          </w:p>
-        </w:tc>
-        <w:tc>
-          <w:tcPr>
-            <w:tcW w:type="dxa" w:w="5040"/>
-          </w:tcPr>
-          <w:p>
-            <w:r>
-              <w:t>Use info() and notice how pandas carries missing numeric data as NaN.</w:t>
-            </w:r>
-          </w:p>
-        </w:tc>
-      </w:tr>
-    </w:tbl>
-    <w:p>
-      <w:pPr>
-        <w:pStyle w:val="Heading1"/>
-      </w:pPr>
-      <w:r>
-        <w:t>10. Exit Questions</w:t>
-      </w:r>
-    </w:p>
-    <w:p>
-      <w:r>
-        <w:t>1.  What is the difference between a Series and a DataFrame?</w:t>
-      </w:r>
-    </w:p>
-    <w:p>
-      <w:r>
-        <w:t>2.  Why does .loc[2:5] include row 5 while .iloc[2:5] does not?</w:t>
-      </w:r>
-    </w:p>
-    <w:p>
-      <w:r>
-        <w:t>3.  What does a Boolean mask contain?</w:t>
-      </w:r>
-    </w:p>
-    <w:p>
-      <w:r>
-        <w:t>4.  Why might a calculated column contain NaN?</w:t>
-      </w:r>
-    </w:p>
-    <w:p>
-      <w:r>
-        <w:t>5.  Which command would you use to count workshops in each category?</w:t>
-      </w:r>
-    </w:p>
-    <w:p>
-      <w:r>
-        <w:t>Instructor note: The repository notebook contains guided tasks but no completed solutions. Copilot is configured as a tutor: hints and unrelated examples are allowed, but assignment-specific final code is prohibited.</w:t>
+        <w:t>Complete the reflection and AI Use Report before submitting.</w:t>
       </w:r>
     </w:p>
     <w:sectPr>
@@ -1365,7 +2030,8 @@
     <w:rsid w:val="00FC693F"/>
     <w:rPr>
       <w:rFonts w:ascii="Aptos" w:hAnsi="Aptos"/>
-      <w:sz w:val="21"/>
+      <w:color w:val="000000"/>
+      <w:sz w:val="20"/>
     </w:rPr>
   </w:style>
   <w:style w:type="paragraph" w:styleId="Header">
@@ -1430,7 +2096,7 @@
       <w:rFonts w:asciiTheme="majorHAnsi" w:eastAsiaTheme="majorEastAsia" w:hAnsiTheme="majorHAnsi" w:cstheme="majorBidi" w:ascii="Aptos Display" w:hAnsi="Aptos Display"/>
       <w:b/>
       <w:bCs/>
-      <w:color w:val="1F4E79"/>
+      <w:color w:val="000000"/>
       <w:sz w:val="28"/>
       <w:szCs w:val="28"/>
     </w:rPr>
@@ -1454,7 +2120,7 @@
       <w:rFonts w:asciiTheme="majorHAnsi" w:eastAsiaTheme="majorEastAsia" w:hAnsiTheme="majorHAnsi" w:cstheme="majorBidi" w:ascii="Aptos Display" w:hAnsi="Aptos Display"/>
       <w:b/>
       <w:bCs/>
-      <w:color w:val="1F4E79"/>
+      <w:color w:val="000000"/>
       <w:sz w:val="26"/>
       <w:szCs w:val="26"/>
     </w:rPr>
@@ -1709,18 +2375,15 @@
     <w:qFormat/>
     <w:rsid w:val="00FC693F"/>
     <w:pPr>
-      <w:pBdr>
-        <w:bottom w:val="single" w:sz="8" w:space="4" w:color="4F81BD" w:themeColor="accent1"/>
-      </w:pBdr>
       <w:spacing w:after="300" w:line="240" w:lineRule="auto"/>
       <w:contextualSpacing/>
     </w:pPr>
     <w:rPr>
       <w:rFonts w:asciiTheme="majorHAnsi" w:eastAsiaTheme="majorEastAsia" w:hAnsiTheme="majorHAnsi" w:cstheme="majorBidi" w:ascii="Aptos Display" w:hAnsi="Aptos Display"/>
-      <w:color w:val="1F4E79"/>
+      <w:color w:val="000000"/>
       <w:spacing w:val="5"/>
       <w:kern w:val="28"/>
-      <w:sz w:val="48"/>
+      <w:sz w:val="46"/>
       <w:szCs w:val="52"/>
     </w:rPr>
   </w:style>

</xml_diff>

<commit_message>
Add explanations to pandas code examples
</commit_message>
<xml_diff>
--- a/CMP262_Week05_Pandas_Class_Summary.docx
+++ b/CMP262_Week05_Pandas_Class_Summary.docx
@@ -244,12 +244,12 @@
             <w:shd w:fill="EAF2F8"/>
           </w:tcPr>
           <w:p>
-            <w:r/>
             <w:r>
               <w:rPr>
-                <w:b w:val="0"/>
+                <w:rFonts w:ascii="Consolas" w:hAnsi="Consolas"/>
+                <w:sz w:val="16"/>
               </w:rPr>
-              <w:t>books["Title"]</w:t>
+              <w:t>books["Title"]  # Selects one column as a Series.</w:t>
             </w:r>
           </w:p>
         </w:tc>
@@ -315,12 +315,12 @@
             <w:shd w:fill="FFFFFF"/>
           </w:tcPr>
           <w:p>
-            <w:r/>
             <w:r>
               <w:rPr>
-                <w:b w:val="0"/>
+                <w:rFonts w:ascii="Consolas" w:hAnsi="Consolas"/>
+                <w:sz w:val="16"/>
               </w:rPr>
-              <w:t>books[["Title", "Genre"]]</w:t>
+              <w:t>books[["Title", "Genre"]]  # Selects two columns as a DataFrame.</w:t>
             </w:r>
           </w:p>
         </w:tc>
@@ -352,9 +352,9 @@
       <w:r>
         <w:rPr>
           <w:rFonts w:ascii="Consolas" w:hAnsi="Consolas"/>
-          <w:sz w:val="19"/>
+          <w:sz w:val="17"/>
         </w:rPr>
-        <w:t>import pandas as pd</w:t>
+        <w:t>import pandas as pd  # Imports pandas and gives it the alias pd.</w:t>
       </w:r>
     </w:p>
     <w:p>
@@ -365,9 +365,9 @@
       <w:r>
         <w:rPr>
           <w:rFonts w:ascii="Consolas" w:hAnsi="Consolas"/>
-          <w:sz w:val="19"/>
+          <w:sz w:val="17"/>
         </w:rPr>
-        <w:t>books = pd.read_excel("BookData.xlsx")</w:t>
+        <w:t>books = pd.read_excel("BookData.xlsx")  # Loads the Excel file into a DataFrame named books.</w:t>
       </w:r>
     </w:p>
     <w:p>
@@ -378,9 +378,9 @@
       <w:r>
         <w:rPr>
           <w:rFonts w:ascii="Consolas" w:hAnsi="Consolas"/>
-          <w:sz w:val="19"/>
+          <w:sz w:val="17"/>
         </w:rPr>
-        <w:t>books.head()          # first five rows</w:t>
+        <w:t>books.head()  # Displays the first five rows of the DataFrame.</w:t>
       </w:r>
     </w:p>
     <w:p>
@@ -391,9 +391,9 @@
       <w:r>
         <w:rPr>
           <w:rFonts w:ascii="Consolas" w:hAnsi="Consolas"/>
-          <w:sz w:val="19"/>
+          <w:sz w:val="17"/>
         </w:rPr>
-        <w:t>books.tail(3)         # last three rows</w:t>
+        <w:t>books.tail(3)  # Displays the last three rows of the DataFrame.</w:t>
       </w:r>
     </w:p>
     <w:p>
@@ -404,9 +404,9 @@
       <w:r>
         <w:rPr>
           <w:rFonts w:ascii="Consolas" w:hAnsi="Consolas"/>
-          <w:sz w:val="19"/>
+          <w:sz w:val="17"/>
         </w:rPr>
-        <w:t>books.shape           # number of rows and columns</w:t>
+        <w:t>books.shape  # Returns the number of rows and columns.</w:t>
       </w:r>
     </w:p>
     <w:p>
@@ -417,9 +417,9 @@
       <w:r>
         <w:rPr>
           <w:rFonts w:ascii="Consolas" w:hAnsi="Consolas"/>
-          <w:sz w:val="19"/>
+          <w:sz w:val="17"/>
         </w:rPr>
-        <w:t>books.sample(4, random_state=3)</w:t>
+        <w:t>books.sample(4, random_state=3)  # Displays four repeatable random rows.</w:t>
       </w:r>
     </w:p>
     <w:p>
@@ -443,9 +443,9 @@
       <w:r>
         <w:rPr>
           <w:rFonts w:ascii="Consolas" w:hAnsi="Consolas"/>
-          <w:sz w:val="19"/>
+          <w:sz w:val="17"/>
         </w:rPr>
-        <w:t>books.columns</w:t>
+        <w:t>books.columns  # Displays all column names.</w:t>
       </w:r>
     </w:p>
     <w:p>
@@ -456,9 +456,9 @@
       <w:r>
         <w:rPr>
           <w:rFonts w:ascii="Consolas" w:hAnsi="Consolas"/>
-          <w:sz w:val="19"/>
+          <w:sz w:val="17"/>
         </w:rPr>
-        <w:t>books.dtypes</w:t>
+        <w:t>books.dtypes  # Displays the data type of each column.</w:t>
       </w:r>
     </w:p>
     <w:p>
@@ -469,9 +469,9 @@
       <w:r>
         <w:rPr>
           <w:rFonts w:ascii="Consolas" w:hAnsi="Consolas"/>
-          <w:sz w:val="19"/>
+          <w:sz w:val="17"/>
         </w:rPr>
-        <w:t>books.info()</w:t>
+        <w:t>books.info()  # Displays column names, data types, and non-null counts.</w:t>
       </w:r>
     </w:p>
     <w:p>
@@ -500,9 +500,9 @@
       <w:r>
         <w:rPr>
           <w:rFonts w:ascii="Consolas" w:hAnsi="Consolas"/>
-          <w:sz w:val="19"/>
+          <w:sz w:val="17"/>
         </w:rPr>
-        <w:t>books["Pages"].mean()</w:t>
+        <w:t>books["Pages"].mean()  # Calculates the average number of pages.</w:t>
       </w:r>
     </w:p>
     <w:p>
@@ -513,9 +513,9 @@
       <w:r>
         <w:rPr>
           <w:rFonts w:ascii="Consolas" w:hAnsi="Consolas"/>
-          <w:sz w:val="19"/>
+          <w:sz w:val="17"/>
         </w:rPr>
-        <w:t>books["Pages"].median()</w:t>
+        <w:t>books["Pages"].median()  # Calculates the middle Pages value.</w:t>
       </w:r>
     </w:p>
     <w:p>
@@ -526,9 +526,9 @@
       <w:r>
         <w:rPr>
           <w:rFonts w:ascii="Consolas" w:hAnsi="Consolas"/>
-          <w:sz w:val="19"/>
+          <w:sz w:val="17"/>
         </w:rPr>
-        <w:t>books["Pages"].min()</w:t>
+        <w:t>books["Pages"].min()  # Finds the smallest Pages value.</w:t>
       </w:r>
     </w:p>
     <w:p>
@@ -539,9 +539,9 @@
       <w:r>
         <w:rPr>
           <w:rFonts w:ascii="Consolas" w:hAnsi="Consolas"/>
-          <w:sz w:val="19"/>
+          <w:sz w:val="17"/>
         </w:rPr>
-        <w:t>books["Pages"].max()</w:t>
+        <w:t>books["Pages"].max()  # Finds the largest Pages value.</w:t>
       </w:r>
     </w:p>
     <w:p>
@@ -552,9 +552,9 @@
       <w:r>
         <w:rPr>
           <w:rFonts w:ascii="Consolas" w:hAnsi="Consolas"/>
-          <w:sz w:val="19"/>
+          <w:sz w:val="17"/>
         </w:rPr>
-        <w:t>books.describe()</w:t>
+        <w:t>books.describe()  # Displays summary statistics for numerical columns.</w:t>
       </w:r>
     </w:p>
     <w:p>
@@ -570,9 +570,9 @@
       <w:r>
         <w:rPr>
           <w:rFonts w:ascii="Consolas" w:hAnsi="Consolas"/>
-          <w:sz w:val="19"/>
+          <w:sz w:val="17"/>
         </w:rPr>
-        <w:t>books["Genre"].unique()</w:t>
+        <w:t>books["Genre"].unique()  # Displays each unique genre.</w:t>
       </w:r>
     </w:p>
     <w:p>
@@ -583,9 +583,9 @@
       <w:r>
         <w:rPr>
           <w:rFonts w:ascii="Consolas" w:hAnsi="Consolas"/>
-          <w:sz w:val="19"/>
+          <w:sz w:val="17"/>
         </w:rPr>
-        <w:t>books["Genre"].value_counts()</w:t>
+        <w:t>books["Genre"].value_counts()  # Counts the books in each genre.</w:t>
       </w:r>
     </w:p>
     <w:p>
@@ -721,12 +721,12 @@
             <w:shd w:fill="EAF2F8"/>
           </w:tcPr>
           <w:p>
-            <w:r/>
             <w:r>
               <w:rPr>
-                <w:b w:val="0"/>
+                <w:rFonts w:ascii="Consolas" w:hAnsi="Consolas"/>
+                <w:sz w:val="16"/>
               </w:rPr>
-              <w:t>books["Title"]</w:t>
+              <w:t>books["Title"]  # Selects one column as a Series.</w:t>
             </w:r>
           </w:p>
         </w:tc>
@@ -792,12 +792,12 @@
             <w:shd w:fill="FFFFFF"/>
           </w:tcPr>
           <w:p>
-            <w:r/>
             <w:r>
               <w:rPr>
-                <w:b w:val="0"/>
+                <w:rFonts w:ascii="Consolas" w:hAnsi="Consolas"/>
+                <w:sz w:val="16"/>
               </w:rPr>
-              <w:t>books[["Title", "Genre"]]</w:t>
+              <w:t>books[["Title", "Genre"]]  # Selects two columns as a DataFrame.</w:t>
             </w:r>
           </w:p>
         </w:tc>
@@ -863,12 +863,12 @@
             <w:shd w:fill="EAF2F8"/>
           </w:tcPr>
           <w:p>
-            <w:r/>
             <w:r>
               <w:rPr>
-                <w:b w:val="0"/>
+                <w:rFonts w:ascii="Consolas" w:hAnsi="Consolas"/>
+                <w:sz w:val="16"/>
               </w:rPr>
-              <w:t>books.loc[1:3, "Title":"Pages"]</w:t>
+              <w:t>books.loc[1:3, "Title":"Pages"]  # Selects labeled rows and columns.</w:t>
             </w:r>
           </w:p>
         </w:tc>
@@ -934,12 +934,12 @@
             <w:shd w:fill="FFFFFF"/>
           </w:tcPr>
           <w:p>
-            <w:r/>
             <w:r>
               <w:rPr>
-                <w:b w:val="0"/>
+                <w:rFonts w:ascii="Consolas" w:hAnsi="Consolas"/>
+                <w:sz w:val="16"/>
               </w:rPr>
-              <w:t>books.iloc[1:4, 0:3]</w:t>
+              <w:t>books.iloc[1:4, 0:3]  # Selects rows and columns by position.</w:t>
             </w:r>
           </w:p>
         </w:tc>
@@ -993,9 +993,9 @@
       <w:r>
         <w:rPr>
           <w:rFonts w:ascii="Consolas" w:hAnsi="Consolas"/>
-          <w:sz w:val="19"/>
+          <w:sz w:val="17"/>
         </w:rPr>
-        <w:t>books.iloc[:4]["Pages"].mean()</w:t>
+        <w:t>books.iloc[:4]["Pages"].mean()  # Finds the average Pages value in the first four rows.</w:t>
       </w:r>
     </w:p>
     <w:p>
@@ -1019,9 +1019,9 @@
       <w:r>
         <w:rPr>
           <w:rFonts w:ascii="Consolas" w:hAnsi="Consolas"/>
-          <w:sz w:val="19"/>
+          <w:sz w:val="17"/>
         </w:rPr>
-        <w:t>books["Sale_Price"] = books["Price"] * 0.90</w:t>
+        <w:t>books["Sale_Price"] = books["Price"] * 0.90  # Creates a column with a 10 percent discount.</w:t>
       </w:r>
     </w:p>
     <w:p>
@@ -1045,9 +1045,9 @@
       <w:r>
         <w:rPr>
           <w:rFonts w:ascii="Consolas" w:hAnsi="Consolas"/>
-          <w:sz w:val="19"/>
+          <w:sz w:val="17"/>
         </w:rPr>
-        <w:t>sorted_books = books.sort_values("Pages", ascending=False)</w:t>
+        <w:t>sorted_books = books.sort_values("Pages", ascending=False)  # Sorts books from most to fewest pages.</w:t>
       </w:r>
     </w:p>
     <w:p>
@@ -1076,9 +1076,9 @@
       <w:r>
         <w:rPr>
           <w:rFonts w:ascii="Consolas" w:hAnsi="Consolas"/>
-          <w:sz w:val="19"/>
+          <w:sz w:val="17"/>
         </w:rPr>
-        <w:t>mask = books["Rating"] &gt;= 4.5</w:t>
+        <w:t>mask = books["Rating"] &gt;= 4.5  # Creates True or False values for ratings of at least 4.5.</w:t>
       </w:r>
     </w:p>
     <w:p>
@@ -1089,9 +1089,9 @@
       <w:r>
         <w:rPr>
           <w:rFonts w:ascii="Consolas" w:hAnsi="Consolas"/>
-          <w:sz w:val="19"/>
+          <w:sz w:val="17"/>
         </w:rPr>
-        <w:t>books[mask]</w:t>
+        <w:t>books[mask]  # Displays only the rows where the mask is True.</w:t>
       </w:r>
     </w:p>
     <w:p>
@@ -1107,9 +1107,9 @@
       <w:r>
         <w:rPr>
           <w:rFonts w:ascii="Consolas" w:hAnsi="Consolas"/>
-          <w:sz w:val="19"/>
+          <w:sz w:val="17"/>
         </w:rPr>
-        <w:t>books[(books["Genre"] == "Mystery") &amp; (books["Pages"] &gt;= 300)]</w:t>
+        <w:t>books[(books["Genre"] == "Mystery") &amp; (books["Pages"] &gt;= 300)]  # Keeps Mystery books with at least 300 pages.</w:t>
       </w:r>
     </w:p>
     <w:p>
@@ -1120,9 +1120,9 @@
       <w:r>
         <w:rPr>
           <w:rFonts w:ascii="Consolas" w:hAnsi="Consolas"/>
-          <w:sz w:val="19"/>
+          <w:sz w:val="17"/>
         </w:rPr>
-        <w:t>books[(books["Genre"] == "Mystery") | (books["Genre"] == "History")]</w:t>
+        <w:t>books[(books["Genre"] == "Mystery") | (books["Genre"] == "History")]  # Keeps Mystery or History books.</w:t>
       </w:r>
     </w:p>
     <w:p>
@@ -1133,9 +1133,9 @@
       <w:r>
         <w:rPr>
           <w:rFonts w:ascii="Consolas" w:hAnsi="Consolas"/>
-          <w:sz w:val="19"/>
+          <w:sz w:val="17"/>
         </w:rPr>
-        <w:t>books[~(books["Format"] == "Digital")]</w:t>
+        <w:t>books[~(books["Format"] == "Digital")]  # Keeps books that are not in Digital format.</w:t>
       </w:r>
     </w:p>
     <w:p>

</xml_diff>